<commit_message>
stop word bug fix and report update
</commit_message>
<xml_diff>
--- a/finalreport.docx
+++ b/finalreport.docx
@@ -21,10 +21,7 @@
         </w:pBdr>
       </w:pPr>
       <w:r>
-        <w:t xml:space="preserve">Gutenberg Search Engine: </w:t>
-      </w:r>
-      <w:r>
-        <w:t>Report</w:t>
+        <w:t>Gutenberg Search Engine: Report</w:t>
       </w:r>
     </w:p>
     <w:p/>
@@ -45,33 +42,7 @@
     </w:p>
     <w:p>
       <w:r>
-        <w:t>94 public-domain books downloaded from Project Gutenberg via the</w:t>
-      </w:r>
-      <w:r>
-        <w:t xml:space="preserve"> </w:t>
-      </w:r>
-      <w:proofErr w:type="spellStart"/>
-      <w:r>
-        <w:t>Gutendex</w:t>
-      </w:r>
-      <w:proofErr w:type="spellEnd"/>
-      <w:r>
-        <w:t xml:space="preserve"> API. The</w:t>
-      </w:r>
-      <w:r>
-        <w:t xml:space="preserve"> </w:t>
-      </w:r>
-      <w:r>
-        <w:t>corpus covers a broad range of classic literature</w:t>
-      </w:r>
-      <w:r>
-        <w:t xml:space="preserve"> </w:t>
-      </w:r>
-      <w:r>
-        <w:t>and non-fiction</w:t>
-      </w:r>
-      <w:r>
-        <w:t>.</w:t>
+        <w:t>94 public-domain books downloaded from Project Gutenberg via the Gutendex API. The corpus covers a broad range of classic literature and non-fiction.</w:t>
       </w:r>
     </w:p>
     <w:p/>
@@ -89,18 +60,7 @@
         </w:numPr>
       </w:pPr>
       <w:r>
-        <w:t xml:space="preserve">Inverted index </w:t>
-      </w:r>
-      <w:proofErr w:type="gramStart"/>
-      <w:r>
-        <w:t xml:space="preserve"> </w:t>
-      </w:r>
-      <w:r>
-        <w:t xml:space="preserve">  (</w:t>
-      </w:r>
-      <w:proofErr w:type="gramEnd"/>
-      <w:r>
-        <w:t>keyword search, AND logic)</w:t>
+        <w:t>Inverted index    (keyword search, AND logic)</w:t>
       </w:r>
     </w:p>
     <w:p>
@@ -111,24 +71,8 @@
           <w:numId w:val="1"/>
         </w:numPr>
       </w:pPr>
-      <w:proofErr w:type="spellStart"/>
-      <w:r>
-        <w:t>Permuterm</w:t>
-      </w:r>
-      <w:proofErr w:type="spellEnd"/>
-      <w:r>
-        <w:t xml:space="preserve"> tree </w:t>
-      </w:r>
-      <w:proofErr w:type="gramStart"/>
-      <w:r>
-        <w:t xml:space="preserve"> </w:t>
-      </w:r>
-      <w:r>
-        <w:t xml:space="preserve">  (</w:t>
-      </w:r>
-      <w:proofErr w:type="gramEnd"/>
-      <w:r>
-        <w:t>wildcard search)</w:t>
+      <w:r>
+        <w:t>Permuterm tree    (wildcard search)</w:t>
       </w:r>
     </w:p>
     <w:p>
@@ -140,38 +84,13 @@
         </w:numPr>
       </w:pPr>
       <w:r>
-        <w:t>Positional index</w:t>
-      </w:r>
-      <w:proofErr w:type="gramStart"/>
-      <w:r>
-        <w:t xml:space="preserve"> </w:t>
-      </w:r>
-      <w:r>
-        <w:t xml:space="preserve">  (</w:t>
-      </w:r>
-      <w:proofErr w:type="gramEnd"/>
-      <w:r>
-        <w:t>phrase search)</w:t>
+        <w:t>Positional index   (phrase search)</w:t>
       </w:r>
     </w:p>
     <w:p/>
     <w:p>
       <w:r>
-        <w:t>All text is normalized via NLTK: tokenize → lowercase →</w:t>
-      </w:r>
-      <w:r>
-        <w:t xml:space="preserve"> </w:t>
-      </w:r>
-      <w:r>
-        <w:t xml:space="preserve">remove </w:t>
-      </w:r>
-      <w:proofErr w:type="spellStart"/>
-      <w:r>
-        <w:t>stopwords</w:t>
-      </w:r>
-      <w:proofErr w:type="spellEnd"/>
-      <w:r>
-        <w:t xml:space="preserve"> → Porter stem.</w:t>
+        <w:t>All text is normalized via NLTK: tokenize → lowercase → remove stopwords → Porter stem.</w:t>
       </w:r>
     </w:p>
     <w:p/>
@@ -221,33 +140,7 @@
         </w:numPr>
       </w:pPr>
       <w:r>
-        <w:t>Each test query has a single clearly correct answer (e.g.,</w:t>
-      </w:r>
-      <w:r>
-        <w:t xml:space="preserve"> </w:t>
-      </w:r>
-      <w:r>
-        <w:t>"</w:t>
-      </w:r>
-      <w:proofErr w:type="spellStart"/>
-      <w:r>
-        <w:t>raskolnikov</w:t>
-      </w:r>
-      <w:proofErr w:type="spellEnd"/>
-      <w:r>
-        <w:t>" should</w:t>
-      </w:r>
-      <w:r>
-        <w:t xml:space="preserve"> </w:t>
-      </w:r>
-      <w:r>
-        <w:t>retrieve Crime and Punishment). This</w:t>
-      </w:r>
-      <w:r>
-        <w:t xml:space="preserve"> </w:t>
-      </w:r>
-      <w:r>
-        <w:t>is what MRR is designed for.</w:t>
+        <w:t>Each test query has a single clearly correct answer (e.g., "raskolnikov" should retrieve Crime and Punishment). This is what MRR is designed for.</w:t>
       </w:r>
     </w:p>
     <w:p>
@@ -259,25 +152,7 @@
         </w:numPr>
       </w:pPr>
       <w:r>
-        <w:t>P</w:t>
-      </w:r>
-      <w:r>
-        <w:t>@1 requires a ranked list to be meaningful</w:t>
-      </w:r>
-      <w:r>
-        <w:t>. S</w:t>
-      </w:r>
-      <w:r>
-        <w:t>ince our system</w:t>
-      </w:r>
-      <w:r>
-        <w:t xml:space="preserve"> </w:t>
-      </w:r>
-      <w:r>
-        <w:t>returns results as an unordered set with no relevance scoring,</w:t>
-      </w:r>
-      <w:r>
-        <w:t xml:space="preserve"> this is irrelevant here.</w:t>
+        <w:t>P@1 requires a ranked list to be meaningful. Since our system returns results as an unordered set with no relevance scoring, this is irrelevant here.</w:t>
       </w:r>
     </w:p>
     <w:p>
@@ -295,13 +170,7 @@
     <w:p>
       <w:r>
         <w:lastRenderedPageBreak/>
-        <w:t>Because our system produces unranked results, reciprocal rank is</w:t>
-      </w:r>
-      <w:r>
-        <w:t xml:space="preserve"> </w:t>
-      </w:r>
-      <w:r>
-        <w:t>defined as:</w:t>
+        <w:t>Because our system produces unranked results, reciprocal rank is defined as:</w:t>
       </w:r>
     </w:p>
     <w:p>
@@ -313,15 +182,7 @@
         </w:numPr>
       </w:pPr>
       <w:r>
-        <w:t xml:space="preserve">RR = </w:t>
-      </w:r>
-      <w:proofErr w:type="gramStart"/>
-      <w:r>
-        <w:t>1  if</w:t>
-      </w:r>
-      <w:proofErr w:type="gramEnd"/>
-      <w:r>
-        <w:t xml:space="preserve"> the correct book appears anywhere in the result set</w:t>
+        <w:t>RR = 1  if the correct book appears anywhere in the result set</w:t>
       </w:r>
     </w:p>
     <w:p>
@@ -333,39 +194,13 @@
         </w:numPr>
       </w:pPr>
       <w:r>
-        <w:t xml:space="preserve">RR = </w:t>
-      </w:r>
-      <w:proofErr w:type="gramStart"/>
-      <w:r>
-        <w:t>0  if</w:t>
-      </w:r>
-      <w:proofErr w:type="gramEnd"/>
-      <w:r>
-        <w:t xml:space="preserve"> the correct book is not retrieved at all</w:t>
+        <w:t>RR = 0  if the correct book is not retrieved at all</w:t>
       </w:r>
     </w:p>
     <w:p/>
     <w:p>
       <w:r>
-        <w:t>Under this definition, MRR equals the fraction of queries where</w:t>
-      </w:r>
-      <w:r>
-        <w:t xml:space="preserve"> </w:t>
-      </w:r>
-      <w:r>
-        <w:t>the system successfully</w:t>
-      </w:r>
-      <w:r>
-        <w:t xml:space="preserve"> </w:t>
-      </w:r>
-      <w:r>
-        <w:t>retrieves the correct book. This is the</w:t>
-      </w:r>
-      <w:r>
-        <w:t xml:space="preserve"> best</w:t>
-      </w:r>
-      <w:r>
-        <w:t xml:space="preserve"> metric for an unranked retrieval system.</w:t>
+        <w:t>Under this definition, MRR equals the fraction of queries where the system successfully retrieves the correct book. This is the best metric for an unranked retrieval system.</w:t>
       </w:r>
     </w:p>
     <w:p/>
@@ -390,19 +225,7 @@
     <w:p/>
     <w:p>
       <w:r>
-        <w:t>20 queries were designed across all three supported query types,</w:t>
-      </w:r>
-      <w:r>
-        <w:t xml:space="preserve"> </w:t>
-      </w:r>
-      <w:r>
-        <w:t xml:space="preserve">each with a known </w:t>
-      </w:r>
-      <w:r>
-        <w:t xml:space="preserve">correct </w:t>
-      </w:r>
-      <w:r>
-        <w:t>book:</w:t>
+        <w:t>20 queries were designed across all three supported query types, each with a known correct book:</w:t>
       </w:r>
     </w:p>
     <w:p/>
@@ -413,31 +236,7 @@
     </w:p>
     <w:p>
       <w:r>
-        <w:t xml:space="preserve">  terms (e.g., "</w:t>
-      </w:r>
-      <w:proofErr w:type="spellStart"/>
-      <w:r>
-        <w:t>raskolnikov</w:t>
-      </w:r>
-      <w:proofErr w:type="spellEnd"/>
-      <w:r>
-        <w:t>", "</w:t>
-      </w:r>
-      <w:proofErr w:type="spellStart"/>
-      <w:r>
-        <w:t>ahab</w:t>
-      </w:r>
-      <w:proofErr w:type="spellEnd"/>
-      <w:r>
-        <w:t>", "</w:t>
-      </w:r>
-      <w:proofErr w:type="spellStart"/>
-      <w:r>
-        <w:t>zarathustra</w:t>
-      </w:r>
-      <w:proofErr w:type="spellEnd"/>
-      <w:r>
-        <w:t>"). These names</w:t>
+        <w:t xml:space="preserve">  terms (e.g., "raskolnikov", "ahab", "zarathustra"). These names</w:t>
       </w:r>
     </w:p>
     <w:p>
@@ -453,38 +252,12 @@
     </w:p>
     <w:p>
       <w:r>
-        <w:t xml:space="preserve">  words with no </w:t>
-      </w:r>
-      <w:proofErr w:type="spellStart"/>
-      <w:r>
-        <w:t>stopwords</w:t>
-      </w:r>
-      <w:proofErr w:type="spellEnd"/>
-      <w:r>
-        <w:t xml:space="preserve"> between them (e.g., "white whale",</w:t>
-      </w:r>
-    </w:p>
-    <w:p>
-      <w:r>
-        <w:t xml:space="preserve">  "</w:t>
-      </w:r>
-      <w:proofErr w:type="spellStart"/>
-      <w:proofErr w:type="gramStart"/>
-      <w:r>
-        <w:t>dorian</w:t>
-      </w:r>
-      <w:proofErr w:type="spellEnd"/>
-      <w:proofErr w:type="gramEnd"/>
-      <w:r>
-        <w:t xml:space="preserve"> gray"). </w:t>
-      </w:r>
-      <w:proofErr w:type="spellStart"/>
-      <w:r>
-        <w:t>Stopwords</w:t>
-      </w:r>
-      <w:proofErr w:type="spellEnd"/>
-      <w:r>
-        <w:t xml:space="preserve"> between query terms cause phrase search</w:t>
+        <w:t xml:space="preserve">  words with no stopwords between them (e.g., "white whale",</w:t>
+      </w:r>
+    </w:p>
+    <w:p>
+      <w:r>
+        <w:t xml:space="preserve">  "dorian gray"). Stopwords between query terms cause phrase search</w:t>
       </w:r>
     </w:p>
     <w:p>
@@ -505,308 +278,1094 @@
     </w:p>
     <w:p>
       <w:r>
-        <w:t xml:space="preserve">  character or title stems (e.g., "</w:t>
-      </w:r>
-      <w:proofErr w:type="spellStart"/>
-      <w:r>
-        <w:t>dracul</w:t>
-      </w:r>
-      <w:proofErr w:type="spellEnd"/>
-      <w:r>
-        <w:t>*", "</w:t>
-      </w:r>
-      <w:proofErr w:type="spellStart"/>
-      <w:r>
-        <w:t>karamaz</w:t>
-      </w:r>
-      <w:proofErr w:type="spellEnd"/>
-      <w:r>
-        <w:t>*").</w:t>
+        <w:t xml:space="preserve">  character or title stems (e.g., "dracul*", "karamaz*").</w:t>
       </w:r>
     </w:p>
     <w:p/>
-    <w:p>
-      <w:r>
+    <w:p/>
+    <w:p/>
+    <w:p>
+      <w:pPr>
+        <w:pBdr>
+          <w:bottom w:val="single" w:sz="6" w:space="1" w:color="auto"/>
+        </w:pBdr>
+      </w:pPr>
+      <w:r>
+        <w:lastRenderedPageBreak/>
         <w:t>RESULTS</w:t>
       </w:r>
     </w:p>
-    <w:p>
-      <w:r>
-        <w:t>-------</w:t>
+    <w:tbl>
+      <w:tblPr>
+        <w:tblW w:w="9360" w:type="dxa"/>
+        <w:tblBorders>
+          <w:top w:val="single" w:sz="4" w:space="0" w:color="CCCCCC"/>
+          <w:left w:val="single" w:sz="4" w:space="0" w:color="CCCCCC"/>
+          <w:bottom w:val="single" w:sz="4" w:space="0" w:color="CCCCCC"/>
+          <w:right w:val="single" w:sz="4" w:space="0" w:color="CCCCCC"/>
+          <w:insideH w:val="single" w:sz="4" w:space="0" w:color="CCCCCC"/>
+          <w:insideV w:val="single" w:sz="4" w:space="0" w:color="CCCCCC"/>
+        </w:tblBorders>
+        <w:tblLook w:val="04A0" w:firstRow="1" w:lastRow="0" w:firstColumn="1" w:lastColumn="0" w:noHBand="0" w:noVBand="1"/>
+      </w:tblPr>
+      <w:tblGrid>
+        <w:gridCol w:w="2600"/>
+        <w:gridCol w:w="4160"/>
+        <w:gridCol w:w="1300"/>
+        <w:gridCol w:w="1300"/>
+      </w:tblGrid>
+      <w:tr>
+        <w:trPr>
+          <w:tblHeader/>
+        </w:trPr>
+        <w:tc>
+          <w:tcPr>
+            <w:tcW w:w="2600" w:type="dxa"/>
+          </w:tcPr>
+          <w:p>
+            <w:pPr>
+              <w:rPr>
+                <w:b/>
+              </w:rPr>
+            </w:pPr>
+            <w:r>
+              <w:rPr>
+                <w:b/>
+              </w:rPr>
+              <w:t>Query</w:t>
+            </w:r>
+          </w:p>
+        </w:tc>
+        <w:tc>
+          <w:tcPr>
+            <w:tcW w:w="4160" w:type="dxa"/>
+          </w:tcPr>
+          <w:p>
+            <w:pPr>
+              <w:rPr>
+                <w:b/>
+              </w:rPr>
+            </w:pPr>
+            <w:r>
+              <w:rPr>
+                <w:b/>
+              </w:rPr>
+              <w:t>Expected Book</w:t>
+            </w:r>
+          </w:p>
+        </w:tc>
+        <w:tc>
+          <w:tcPr>
+            <w:tcW w:w="1300" w:type="dxa"/>
+          </w:tcPr>
+          <w:p>
+            <w:pPr>
+              <w:jc w:val="center"/>
+              <w:rPr>
+                <w:b/>
+              </w:rPr>
+            </w:pPr>
+            <w:r>
+              <w:rPr>
+                <w:b/>
+              </w:rPr>
+              <w:t>Found</w:t>
+            </w:r>
+          </w:p>
+        </w:tc>
+        <w:tc>
+          <w:tcPr>
+            <w:tcW w:w="1300" w:type="dxa"/>
+          </w:tcPr>
+          <w:p>
+            <w:pPr>
+              <w:jc w:val="center"/>
+              <w:rPr>
+                <w:b/>
+              </w:rPr>
+            </w:pPr>
+            <w:r>
+              <w:rPr>
+                <w:b/>
+              </w:rPr>
+              <w:t>N Results</w:t>
+            </w:r>
+          </w:p>
+        </w:tc>
+      </w:tr>
+      <w:tr>
+        <w:tc>
+          <w:tcPr>
+            <w:tcW w:w="2600" w:type="dxa"/>
+          </w:tcPr>
+          <w:p>
+            <w:r>
+              <w:t>raskolnikov</w:t>
+            </w:r>
+          </w:p>
+        </w:tc>
+        <w:tc>
+          <w:tcPr>
+            <w:tcW w:w="4160" w:type="dxa"/>
+          </w:tcPr>
+          <w:p>
+            <w:r>
+              <w:t>Crime and Punishment</w:t>
+            </w:r>
+          </w:p>
+        </w:tc>
+        <w:tc>
+          <w:tcPr>
+            <w:tcW w:w="1300" w:type="dxa"/>
+          </w:tcPr>
+          <w:p>
+            <w:pPr>
+              <w:jc w:val="center"/>
+            </w:pPr>
+            <w:r>
+              <w:t>YES</w:t>
+            </w:r>
+          </w:p>
+        </w:tc>
+        <w:tc>
+          <w:tcPr>
+            <w:tcW w:w="1300" w:type="dxa"/>
+          </w:tcPr>
+          <w:p>
+            <w:pPr>
+              <w:jc w:val="center"/>
+            </w:pPr>
+            <w:r>
+              <w:t>1</w:t>
+            </w:r>
+          </w:p>
+        </w:tc>
+      </w:tr>
+      <w:tr>
+        <w:tc>
+          <w:tcPr>
+            <w:tcW w:w="2600" w:type="dxa"/>
+          </w:tcPr>
+          <w:p>
+            <w:r>
+              <w:t>gatsby</w:t>
+            </w:r>
+          </w:p>
+        </w:tc>
+        <w:tc>
+          <w:tcPr>
+            <w:tcW w:w="4160" w:type="dxa"/>
+          </w:tcPr>
+          <w:p>
+            <w:r>
+              <w:t>The Great Gatsby</w:t>
+            </w:r>
+          </w:p>
+        </w:tc>
+        <w:tc>
+          <w:tcPr>
+            <w:tcW w:w="1300" w:type="dxa"/>
+          </w:tcPr>
+          <w:p>
+            <w:pPr>
+              <w:jc w:val="center"/>
+            </w:pPr>
+            <w:r>
+              <w:t>YES</w:t>
+            </w:r>
+          </w:p>
+        </w:tc>
+        <w:tc>
+          <w:tcPr>
+            <w:tcW w:w="1300" w:type="dxa"/>
+          </w:tcPr>
+          <w:p>
+            <w:pPr>
+              <w:jc w:val="center"/>
+            </w:pPr>
+            <w:r>
+              <w:t>1</w:t>
+            </w:r>
+          </w:p>
+        </w:tc>
+      </w:tr>
+      <w:tr>
+        <w:tc>
+          <w:tcPr>
+            <w:tcW w:w="2600" w:type="dxa"/>
+          </w:tcPr>
+          <w:p>
+            <w:r>
+              <w:t>karamazov</w:t>
+            </w:r>
+          </w:p>
+        </w:tc>
+        <w:tc>
+          <w:tcPr>
+            <w:tcW w:w="4160" w:type="dxa"/>
+          </w:tcPr>
+          <w:p>
+            <w:r>
+              <w:t>The Brothers Karamazov</w:t>
+            </w:r>
+          </w:p>
+        </w:tc>
+        <w:tc>
+          <w:tcPr>
+            <w:tcW w:w="1300" w:type="dxa"/>
+          </w:tcPr>
+          <w:p>
+            <w:pPr>
+              <w:jc w:val="center"/>
+            </w:pPr>
+            <w:r>
+              <w:t>YES</w:t>
+            </w:r>
+          </w:p>
+        </w:tc>
+        <w:tc>
+          <w:tcPr>
+            <w:tcW w:w="1300" w:type="dxa"/>
+          </w:tcPr>
+          <w:p>
+            <w:pPr>
+              <w:jc w:val="center"/>
+            </w:pPr>
+            <w:r>
+              <w:t>2</w:t>
+            </w:r>
+          </w:p>
+        </w:tc>
+      </w:tr>
+      <w:tr>
+        <w:tc>
+          <w:tcPr>
+            <w:tcW w:w="2600" w:type="dxa"/>
+          </w:tcPr>
+          <w:p>
+            <w:r>
+              <w:t>zarathustra</w:t>
+            </w:r>
+          </w:p>
+        </w:tc>
+        <w:tc>
+          <w:tcPr>
+            <w:tcW w:w="4160" w:type="dxa"/>
+          </w:tcPr>
+          <w:p>
+            <w:r>
+              <w:t>Thus Spake Zarathustra</w:t>
+            </w:r>
+          </w:p>
+        </w:tc>
+        <w:tc>
+          <w:tcPr>
+            <w:tcW w:w="1300" w:type="dxa"/>
+          </w:tcPr>
+          <w:p>
+            <w:pPr>
+              <w:jc w:val="center"/>
+            </w:pPr>
+            <w:r>
+              <w:t>YES</w:t>
+            </w:r>
+          </w:p>
+        </w:tc>
+        <w:tc>
+          <w:tcPr>
+            <w:tcW w:w="1300" w:type="dxa"/>
+          </w:tcPr>
+          <w:p>
+            <w:pPr>
+              <w:jc w:val="center"/>
+            </w:pPr>
+            <w:r>
+              <w:t>4</w:t>
+            </w:r>
+          </w:p>
+        </w:tc>
+      </w:tr>
+      <w:tr>
+        <w:tc>
+          <w:tcPr>
+            <w:tcW w:w="2600" w:type="dxa"/>
+          </w:tcPr>
+          <w:p>
+            <w:r>
+              <w:t>huckleberry</w:t>
+            </w:r>
+          </w:p>
+        </w:tc>
+        <w:tc>
+          <w:tcPr>
+            <w:tcW w:w="4160" w:type="dxa"/>
+          </w:tcPr>
+          <w:p>
+            <w:r>
+              <w:t>Adventures of Huckleberry Finn</w:t>
+            </w:r>
+          </w:p>
+        </w:tc>
+        <w:tc>
+          <w:tcPr>
+            <w:tcW w:w="1300" w:type="dxa"/>
+          </w:tcPr>
+          <w:p>
+            <w:pPr>
+              <w:jc w:val="center"/>
+            </w:pPr>
+            <w:r>
+              <w:t>YES</w:t>
+            </w:r>
+          </w:p>
+        </w:tc>
+        <w:tc>
+          <w:tcPr>
+            <w:tcW w:w="1300" w:type="dxa"/>
+          </w:tcPr>
+          <w:p>
+            <w:pPr>
+              <w:jc w:val="center"/>
+            </w:pPr>
+            <w:r>
+              <w:t>3</w:t>
+            </w:r>
+          </w:p>
+        </w:tc>
+      </w:tr>
+      <w:tr>
+        <w:tc>
+          <w:tcPr>
+            <w:tcW w:w="2600" w:type="dxa"/>
+          </w:tcPr>
+          <w:p>
+            <w:r>
+              <w:t>dracula</w:t>
+            </w:r>
+          </w:p>
+        </w:tc>
+        <w:tc>
+          <w:tcPr>
+            <w:tcW w:w="4160" w:type="dxa"/>
+          </w:tcPr>
+          <w:p>
+            <w:r>
+              <w:t>Dracula</w:t>
+            </w:r>
+          </w:p>
+        </w:tc>
+        <w:tc>
+          <w:tcPr>
+            <w:tcW w:w="1300" w:type="dxa"/>
+          </w:tcPr>
+          <w:p>
+            <w:pPr>
+              <w:jc w:val="center"/>
+            </w:pPr>
+            <w:r>
+              <w:t>YES</w:t>
+            </w:r>
+          </w:p>
+        </w:tc>
+        <w:tc>
+          <w:tcPr>
+            <w:tcW w:w="1300" w:type="dxa"/>
+          </w:tcPr>
+          <w:p>
+            <w:pPr>
+              <w:jc w:val="center"/>
+            </w:pPr>
+            <w:r>
+              <w:t>1</w:t>
+            </w:r>
+          </w:p>
+        </w:tc>
+      </w:tr>
+      <w:tr>
+        <w:tc>
+          <w:tcPr>
+            <w:tcW w:w="2600" w:type="dxa"/>
+          </w:tcPr>
+          <w:p>
+            <w:r>
+              <w:t>beowulf</w:t>
+            </w:r>
+          </w:p>
+        </w:tc>
+        <w:tc>
+          <w:tcPr>
+            <w:tcW w:w="4160" w:type="dxa"/>
+          </w:tcPr>
+          <w:p>
+            <w:r>
+              <w:t>Beowulf</w:t>
+            </w:r>
+          </w:p>
+        </w:tc>
+        <w:tc>
+          <w:tcPr>
+            <w:tcW w:w="1300" w:type="dxa"/>
+          </w:tcPr>
+          <w:p>
+            <w:pPr>
+              <w:jc w:val="center"/>
+            </w:pPr>
+            <w:r>
+              <w:t>YES</w:t>
+            </w:r>
+          </w:p>
+        </w:tc>
+        <w:tc>
+          <w:tcPr>
+            <w:tcW w:w="1300" w:type="dxa"/>
+          </w:tcPr>
+          <w:p>
+            <w:pPr>
+              <w:jc w:val="center"/>
+            </w:pPr>
+            <w:r>
+              <w:t>2</w:t>
+            </w:r>
+          </w:p>
+        </w:tc>
+      </w:tr>
+      <w:tr>
+        <w:tc>
+          <w:tcPr>
+            <w:tcW w:w="2600" w:type="dxa"/>
+          </w:tcPr>
+          <w:p>
+            <w:r>
+              <w:t>odysseus</w:t>
+            </w:r>
+          </w:p>
+        </w:tc>
+        <w:tc>
+          <w:tcPr>
+            <w:tcW w:w="4160" w:type="dxa"/>
+          </w:tcPr>
+          <w:p>
+            <w:r>
+              <w:t>The Odyssey</w:t>
+            </w:r>
+          </w:p>
+        </w:tc>
+        <w:tc>
+          <w:tcPr>
+            <w:tcW w:w="1300" w:type="dxa"/>
+          </w:tcPr>
+          <w:p>
+            <w:pPr>
+              <w:jc w:val="center"/>
+            </w:pPr>
+            <w:r>
+              <w:t>YES</w:t>
+            </w:r>
+          </w:p>
+        </w:tc>
+        <w:tc>
+          <w:tcPr>
+            <w:tcW w:w="1300" w:type="dxa"/>
+          </w:tcPr>
+          <w:p>
+            <w:pPr>
+              <w:jc w:val="center"/>
+            </w:pPr>
+            <w:r>
+              <w:t>4</w:t>
+            </w:r>
+          </w:p>
+        </w:tc>
+      </w:tr>
+      <w:tr>
+        <w:tc>
+          <w:tcPr>
+            <w:tcW w:w="2600" w:type="dxa"/>
+          </w:tcPr>
+          <w:p>
+            <w:r>
+              <w:t>leviathan</w:t>
+            </w:r>
+          </w:p>
+        </w:tc>
+        <w:tc>
+          <w:tcPr>
+            <w:tcW w:w="4160" w:type="dxa"/>
+          </w:tcPr>
+          <w:p>
+            <w:r>
+              <w:t>Leviathan</w:t>
+            </w:r>
+          </w:p>
+        </w:tc>
+        <w:tc>
+          <w:tcPr>
+            <w:tcW w:w="1300" w:type="dxa"/>
+          </w:tcPr>
+          <w:p>
+            <w:pPr>
+              <w:jc w:val="center"/>
+            </w:pPr>
+            <w:r>
+              <w:t>YES</w:t>
+            </w:r>
+          </w:p>
+        </w:tc>
+        <w:tc>
+          <w:tcPr>
+            <w:tcW w:w="1300" w:type="dxa"/>
+          </w:tcPr>
+          <w:p>
+            <w:pPr>
+              <w:jc w:val="center"/>
+            </w:pPr>
+            <w:r>
+              <w:t>7</w:t>
+            </w:r>
+          </w:p>
+        </w:tc>
+      </w:tr>
+      <w:tr>
+        <w:tc>
+          <w:tcPr>
+            <w:tcW w:w="2600" w:type="dxa"/>
+          </w:tcPr>
+          <w:p>
+            <w:r>
+              <w:t>gregor</w:t>
+            </w:r>
+          </w:p>
+        </w:tc>
+        <w:tc>
+          <w:tcPr>
+            <w:tcW w:w="4160" w:type="dxa"/>
+          </w:tcPr>
+          <w:p>
+            <w:r>
+              <w:t>Metamorphosis</w:t>
+            </w:r>
+          </w:p>
+        </w:tc>
+        <w:tc>
+          <w:tcPr>
+            <w:tcW w:w="1300" w:type="dxa"/>
+          </w:tcPr>
+          <w:p>
+            <w:pPr>
+              <w:jc w:val="center"/>
+            </w:pPr>
+            <w:r>
+              <w:t>YES</w:t>
+            </w:r>
+          </w:p>
+        </w:tc>
+        <w:tc>
+          <w:tcPr>
+            <w:tcW w:w="1300" w:type="dxa"/>
+          </w:tcPr>
+          <w:p>
+            <w:pPr>
+              <w:jc w:val="center"/>
+            </w:pPr>
+            <w:r>
+              <w:t>8</w:t>
+            </w:r>
+          </w:p>
+        </w:tc>
+      </w:tr>
+      <w:tr>
+        <w:tc>
+          <w:tcPr>
+            <w:tcW w:w="2600" w:type="dxa"/>
+          </w:tcPr>
+          <w:p>
+            <w:r>
+              <w:t>"dorian gray"</w:t>
+            </w:r>
+          </w:p>
+        </w:tc>
+        <w:tc>
+          <w:tcPr>
+            <w:tcW w:w="4160" w:type="dxa"/>
+          </w:tcPr>
+          <w:p>
+            <w:r>
+              <w:t>The Picture of Dorian Gray</w:t>
+            </w:r>
+          </w:p>
+        </w:tc>
+        <w:tc>
+          <w:tcPr>
+            <w:tcW w:w="1300" w:type="dxa"/>
+          </w:tcPr>
+          <w:p>
+            <w:pPr>
+              <w:jc w:val="center"/>
+            </w:pPr>
+            <w:r>
+              <w:t>YES</w:t>
+            </w:r>
+          </w:p>
+        </w:tc>
+        <w:tc>
+          <w:tcPr>
+            <w:tcW w:w="1300" w:type="dxa"/>
+          </w:tcPr>
+          <w:p>
+            <w:pPr>
+              <w:jc w:val="center"/>
+            </w:pPr>
+            <w:r>
+              <w:t>1</w:t>
+            </w:r>
+          </w:p>
+        </w:tc>
+      </w:tr>
+      <w:tr>
+        <w:tc>
+          <w:tcPr>
+            <w:tcW w:w="2600" w:type="dxa"/>
+          </w:tcPr>
+          <w:p>
+            <w:r>
+              <w:t>"sherlock holmes"</w:t>
+            </w:r>
+          </w:p>
+        </w:tc>
+        <w:tc>
+          <w:tcPr>
+            <w:tcW w:w="4160" w:type="dxa"/>
+          </w:tcPr>
+          <w:p>
+            <w:r>
+              <w:t>A Study in Scarlet (+ Doyle)</w:t>
+            </w:r>
+          </w:p>
+        </w:tc>
+        <w:tc>
+          <w:tcPr>
+            <w:tcW w:w="1300" w:type="dxa"/>
+          </w:tcPr>
+          <w:p>
+            <w:pPr>
+              <w:jc w:val="center"/>
+            </w:pPr>
+            <w:r>
+              <w:t>YES</w:t>
+            </w:r>
+          </w:p>
+        </w:tc>
+        <w:tc>
+          <w:tcPr>
+            <w:tcW w:w="1300" w:type="dxa"/>
+          </w:tcPr>
+          <w:p>
+            <w:pPr>
+              <w:jc w:val="center"/>
+            </w:pPr>
+            <w:r>
+              <w:t>7</w:t>
+            </w:r>
+          </w:p>
+        </w:tc>
+      </w:tr>
+      <w:tr>
+        <w:tc>
+          <w:tcPr>
+            <w:tcW w:w="2600" w:type="dxa"/>
+          </w:tcPr>
+          <w:p>
+            <w:r>
+              <w:t>"great expectations"</w:t>
+            </w:r>
+          </w:p>
+        </w:tc>
+        <w:tc>
+          <w:tcPr>
+            <w:tcW w:w="4160" w:type="dxa"/>
+          </w:tcPr>
+          <w:p>
+            <w:r>
+              <w:t>Great Expectations</w:t>
+            </w:r>
+          </w:p>
+        </w:tc>
+        <w:tc>
+          <w:tcPr>
+            <w:tcW w:w="1300" w:type="dxa"/>
+          </w:tcPr>
+          <w:p>
+            <w:pPr>
+              <w:jc w:val="center"/>
+            </w:pPr>
+            <w:r>
+              <w:t>YES</w:t>
+            </w:r>
+          </w:p>
+        </w:tc>
+        <w:tc>
+          <w:tcPr>
+            <w:tcW w:w="1300" w:type="dxa"/>
+          </w:tcPr>
+          <w:p>
+            <w:pPr>
+              <w:jc w:val="center"/>
+            </w:pPr>
+            <w:r>
+              <w:t>6</w:t>
+            </w:r>
+          </w:p>
+        </w:tc>
+      </w:tr>
+      <w:tr>
+        <w:tc>
+          <w:tcPr>
+            <w:tcW w:w="2600" w:type="dxa"/>
+          </w:tcPr>
+          <w:p>
+            <w:r>
+              <w:t>"war and peace" [stopword]</w:t>
+            </w:r>
+          </w:p>
+        </w:tc>
+        <w:tc>
+          <w:tcPr>
+            <w:tcW w:w="4160" w:type="dxa"/>
+          </w:tcPr>
+          <w:p>
+            <w:r>
+              <w:t>War and Peace</w:t>
+            </w:r>
+          </w:p>
+        </w:tc>
+        <w:tc>
+          <w:tcPr>
+            <w:tcW w:w="1300" w:type="dxa"/>
+          </w:tcPr>
+          <w:p>
+            <w:pPr>
+              <w:jc w:val="center"/>
+            </w:pPr>
+            <w:r>
+              <w:t>YES</w:t>
+            </w:r>
+          </w:p>
+        </w:tc>
+        <w:tc>
+          <w:tcPr>
+            <w:tcW w:w="1300" w:type="dxa"/>
+          </w:tcPr>
+          <w:p>
+            <w:pPr>
+              <w:jc w:val="center"/>
+            </w:pPr>
+            <w:r>
+              <w:t>10</w:t>
+            </w:r>
+          </w:p>
+        </w:tc>
+      </w:tr>
+      <w:tr>
+        <w:tc>
+          <w:tcPr>
+            <w:tcW w:w="2600" w:type="dxa"/>
+          </w:tcPr>
+          <w:p>
+            <w:r>
+              <w:t>"jekyll and hyde" [stopword]</w:t>
+            </w:r>
+          </w:p>
+        </w:tc>
+        <w:tc>
+          <w:tcPr>
+            <w:tcW w:w="4160" w:type="dxa"/>
+          </w:tcPr>
+          <w:p>
+            <w:r>
+              <w:t>Dr. Jekyll and Mr. Hyde</w:t>
+            </w:r>
+          </w:p>
+        </w:tc>
+        <w:tc>
+          <w:tcPr>
+            <w:tcW w:w="1300" w:type="dxa"/>
+          </w:tcPr>
+          <w:p>
+            <w:pPr>
+              <w:jc w:val="center"/>
+            </w:pPr>
+            <w:r>
+              <w:t>YES</w:t>
+            </w:r>
+          </w:p>
+        </w:tc>
+        <w:tc>
+          <w:tcPr>
+            <w:tcW w:w="1300" w:type="dxa"/>
+          </w:tcPr>
+          <w:p>
+            <w:pPr>
+              <w:jc w:val="center"/>
+            </w:pPr>
+            <w:r>
+              <w:t>1</w:t>
+            </w:r>
+          </w:p>
+        </w:tc>
+      </w:tr>
+      <w:tr>
+        <w:tc>
+          <w:tcPr>
+            <w:tcW w:w="2600" w:type="dxa"/>
+          </w:tcPr>
+          <w:p>
+            <w:r>
+              <w:t>dracul*</w:t>
+            </w:r>
+          </w:p>
+        </w:tc>
+        <w:tc>
+          <w:tcPr>
+            <w:tcW w:w="4160" w:type="dxa"/>
+          </w:tcPr>
+          <w:p>
+            <w:r>
+              <w:t>Dracula</w:t>
+            </w:r>
+          </w:p>
+        </w:tc>
+        <w:tc>
+          <w:tcPr>
+            <w:tcW w:w="1300" w:type="dxa"/>
+          </w:tcPr>
+          <w:p>
+            <w:pPr>
+              <w:jc w:val="center"/>
+            </w:pPr>
+            <w:r>
+              <w:t>YES</w:t>
+            </w:r>
+          </w:p>
+        </w:tc>
+        <w:tc>
+          <w:tcPr>
+            <w:tcW w:w="1300" w:type="dxa"/>
+          </w:tcPr>
+          <w:p>
+            <w:pPr>
+              <w:jc w:val="center"/>
+            </w:pPr>
+            <w:r>
+              <w:t>1</w:t>
+            </w:r>
+          </w:p>
+        </w:tc>
+      </w:tr>
+      <w:tr>
+        <w:tc>
+          <w:tcPr>
+            <w:tcW w:w="2600" w:type="dxa"/>
+          </w:tcPr>
+          <w:p>
+            <w:r>
+              <w:t>karamaz*</w:t>
+            </w:r>
+          </w:p>
+        </w:tc>
+        <w:tc>
+          <w:tcPr>
+            <w:tcW w:w="4160" w:type="dxa"/>
+          </w:tcPr>
+          <w:p>
+            <w:r>
+              <w:t>The Brothers Karamazov</w:t>
+            </w:r>
+          </w:p>
+        </w:tc>
+        <w:tc>
+          <w:tcPr>
+            <w:tcW w:w="1300" w:type="dxa"/>
+          </w:tcPr>
+          <w:p>
+            <w:pPr>
+              <w:jc w:val="center"/>
+            </w:pPr>
+            <w:r>
+              <w:t>YES</w:t>
+            </w:r>
+          </w:p>
+        </w:tc>
+        <w:tc>
+          <w:tcPr>
+            <w:tcW w:w="1300" w:type="dxa"/>
+          </w:tcPr>
+          <w:p>
+            <w:pPr>
+              <w:jc w:val="center"/>
+            </w:pPr>
+            <w:r>
+              <w:t>2</w:t>
+            </w:r>
+          </w:p>
+        </w:tc>
+      </w:tr>
+      <w:tr>
+        <w:tc>
+          <w:tcPr>
+            <w:tcW w:w="2600" w:type="dxa"/>
+          </w:tcPr>
+          <w:p>
+            <w:r>
+              <w:t>zarathustr*</w:t>
+            </w:r>
+          </w:p>
+        </w:tc>
+        <w:tc>
+          <w:tcPr>
+            <w:tcW w:w="4160" w:type="dxa"/>
+          </w:tcPr>
+          <w:p>
+            <w:r>
+              <w:t>Thus Spake Zarathustra</w:t>
+            </w:r>
+          </w:p>
+        </w:tc>
+        <w:tc>
+          <w:tcPr>
+            <w:tcW w:w="1300" w:type="dxa"/>
+          </w:tcPr>
+          <w:p>
+            <w:pPr>
+              <w:jc w:val="center"/>
+            </w:pPr>
+            <w:r>
+              <w:t>YES</w:t>
+            </w:r>
+          </w:p>
+        </w:tc>
+        <w:tc>
+          <w:tcPr>
+            <w:tcW w:w="1300" w:type="dxa"/>
+          </w:tcPr>
+          <w:p>
+            <w:pPr>
+              <w:jc w:val="center"/>
+            </w:pPr>
+            <w:r>
+              <w:t>4</w:t>
+            </w:r>
+          </w:p>
+        </w:tc>
+      </w:tr>
+      <w:tr>
+        <w:tc>
+          <w:tcPr>
+            <w:tcW w:w="2600" w:type="dxa"/>
+          </w:tcPr>
+          <w:p>
+            <w:r>
+              <w:t>huckleberr*</w:t>
+            </w:r>
+          </w:p>
+        </w:tc>
+        <w:tc>
+          <w:tcPr>
+            <w:tcW w:w="4160" w:type="dxa"/>
+          </w:tcPr>
+          <w:p>
+            <w:r>
+              <w:t>Adventures of Huckleberry Finn</w:t>
+            </w:r>
+          </w:p>
+        </w:tc>
+        <w:tc>
+          <w:tcPr>
+            <w:tcW w:w="1300" w:type="dxa"/>
+          </w:tcPr>
+          <w:p>
+            <w:pPr>
+              <w:jc w:val="center"/>
+            </w:pPr>
+            <w:r>
+              <w:t>YES</w:t>
+            </w:r>
+          </w:p>
+        </w:tc>
+        <w:tc>
+          <w:tcPr>
+            <w:tcW w:w="1300" w:type="dxa"/>
+          </w:tcPr>
+          <w:p>
+            <w:pPr>
+              <w:jc w:val="center"/>
+            </w:pPr>
+            <w:r>
+              <w:t>3</w:t>
+            </w:r>
+          </w:p>
+        </w:tc>
+      </w:tr>
+      <w:tr>
+        <w:tc>
+          <w:tcPr>
+            <w:tcW w:w="2600" w:type="dxa"/>
+          </w:tcPr>
+          <w:p>
+            <w:r>
+              <w:t>raskolnik*</w:t>
+            </w:r>
+          </w:p>
+        </w:tc>
+        <w:tc>
+          <w:tcPr>
+            <w:tcW w:w="4160" w:type="dxa"/>
+          </w:tcPr>
+          <w:p>
+            <w:r>
+              <w:t>Crime and Punishment</w:t>
+            </w:r>
+          </w:p>
+        </w:tc>
+        <w:tc>
+          <w:tcPr>
+            <w:tcW w:w="1300" w:type="dxa"/>
+          </w:tcPr>
+          <w:p>
+            <w:pPr>
+              <w:jc w:val="center"/>
+            </w:pPr>
+            <w:r>
+              <w:t>YES</w:t>
+            </w:r>
+          </w:p>
+        </w:tc>
+        <w:tc>
+          <w:tcPr>
+            <w:tcW w:w="1300" w:type="dxa"/>
+          </w:tcPr>
+          <w:p>
+            <w:pPr>
+              <w:jc w:val="center"/>
+            </w:pPr>
+            <w:r>
+              <w:t>1</w:t>
+            </w:r>
+          </w:p>
+        </w:tc>
+      </w:tr>
+    </w:tbl>
+    <w:p/>
+    <w:p>
+      <w:r>
+        <w:t>Queries correct:  20 / 20</w:t>
       </w:r>
     </w:p>
     <w:p>
       <w:r>
         <w:lastRenderedPageBreak/>
-        <w:t>Query                          Expected Book                  Found   N results</w:t>
-      </w:r>
-    </w:p>
-    <w:p>
-      <w:r>
-        <w:t>-------------------------------------------------------------------------------</w:t>
-      </w:r>
-    </w:p>
-    <w:p>
-      <w:proofErr w:type="spellStart"/>
-      <w:r>
-        <w:t>raskolnikov</w:t>
-      </w:r>
-      <w:proofErr w:type="spellEnd"/>
-      <w:r>
-        <w:t xml:space="preserve">                    Crime and Punishment           YES     1</w:t>
-      </w:r>
-    </w:p>
-    <w:p>
-      <w:proofErr w:type="spellStart"/>
-      <w:r>
-        <w:t>gatsby</w:t>
-      </w:r>
-      <w:proofErr w:type="spellEnd"/>
-      <w:r>
-        <w:t xml:space="preserve">                         The Great Gatsby               YES     1</w:t>
-      </w:r>
-    </w:p>
-    <w:p>
-      <w:proofErr w:type="spellStart"/>
-      <w:r>
-        <w:t>ahab</w:t>
-      </w:r>
-      <w:proofErr w:type="spellEnd"/>
-      <w:r>
-        <w:t xml:space="preserve">                           Moby Dick                      YES     4</w:t>
-      </w:r>
-    </w:p>
-    <w:p>
-      <w:proofErr w:type="spellStart"/>
-      <w:r>
-        <w:t>karamazov</w:t>
-      </w:r>
-      <w:proofErr w:type="spellEnd"/>
-      <w:r>
-        <w:t xml:space="preserve">                      The Brothers Karamazov         YES     2</w:t>
-      </w:r>
-    </w:p>
-    <w:p>
-      <w:proofErr w:type="spellStart"/>
-      <w:r>
-        <w:t>zarathustra</w:t>
-      </w:r>
-      <w:proofErr w:type="spellEnd"/>
-      <w:r>
-        <w:t xml:space="preserve">                    Thus Spake Zarathustra         YES     4</w:t>
-      </w:r>
-    </w:p>
-    <w:p>
-      <w:r>
-        <w:t>huckleberry                    Adventures of Huckleberry Finn YES     3</w:t>
-      </w:r>
-    </w:p>
-    <w:p>
-      <w:proofErr w:type="spellStart"/>
-      <w:r>
-        <w:t>dracula</w:t>
-      </w:r>
-      <w:proofErr w:type="spellEnd"/>
-      <w:r>
-        <w:t xml:space="preserve">                        Dracula                        YES     1</w:t>
-      </w:r>
-    </w:p>
-    <w:p>
-      <w:proofErr w:type="spellStart"/>
-      <w:r>
-        <w:t>beowulf</w:t>
-      </w:r>
-      <w:proofErr w:type="spellEnd"/>
-      <w:r>
-        <w:t xml:space="preserve">                        Beowulf                        YES     2</w:t>
-      </w:r>
-    </w:p>
-    <w:p>
-      <w:proofErr w:type="spellStart"/>
-      <w:r>
-        <w:t>odysseus</w:t>
-      </w:r>
-      <w:proofErr w:type="spellEnd"/>
-      <w:r>
-        <w:t xml:space="preserve">                       The Odyssey                    YES     4</w:t>
-      </w:r>
-    </w:p>
-    <w:p>
-      <w:r>
-        <w:t xml:space="preserve">leviathan                      </w:t>
-      </w:r>
-      <w:proofErr w:type="spellStart"/>
-      <w:r>
-        <w:t>Leviathan</w:t>
-      </w:r>
-      <w:proofErr w:type="spellEnd"/>
-      <w:r>
-        <w:t xml:space="preserve">                      YES     9</w:t>
-      </w:r>
-    </w:p>
-    <w:p>
-      <w:r>
-        <w:t>"</w:t>
-      </w:r>
-      <w:proofErr w:type="gramStart"/>
-      <w:r>
-        <w:t>white</w:t>
-      </w:r>
-      <w:proofErr w:type="gramEnd"/>
-      <w:r>
-        <w:t xml:space="preserve"> whale"                  Moby Dick                      YES     2</w:t>
-      </w:r>
-    </w:p>
-    <w:p>
-      <w:r>
-        <w:t>"</w:t>
-      </w:r>
-      <w:proofErr w:type="gramStart"/>
-      <w:r>
-        <w:t>captain</w:t>
-      </w:r>
-      <w:proofErr w:type="gramEnd"/>
-      <w:r>
-        <w:t xml:space="preserve"> </w:t>
-      </w:r>
-      <w:proofErr w:type="spellStart"/>
-      <w:r>
-        <w:t>ahab</w:t>
-      </w:r>
-      <w:proofErr w:type="spellEnd"/>
-      <w:r>
-        <w:t>"                 Moby Dick                      YES     1</w:t>
-      </w:r>
-    </w:p>
-    <w:p>
-      <w:r>
-        <w:t>"</w:t>
-      </w:r>
-      <w:proofErr w:type="spellStart"/>
-      <w:proofErr w:type="gramStart"/>
-      <w:r>
-        <w:t>dorian</w:t>
-      </w:r>
-      <w:proofErr w:type="spellEnd"/>
-      <w:proofErr w:type="gramEnd"/>
-      <w:r>
-        <w:t xml:space="preserve"> gray"                  The Picture of Dorian Gray     YES     1</w:t>
-      </w:r>
-    </w:p>
-    <w:p>
-      <w:r>
-        <w:t>"</w:t>
-      </w:r>
-      <w:proofErr w:type="gramStart"/>
-      <w:r>
-        <w:t>sherlock</w:t>
-      </w:r>
-      <w:proofErr w:type="gramEnd"/>
-      <w:r>
-        <w:t xml:space="preserve"> </w:t>
-      </w:r>
-      <w:proofErr w:type="spellStart"/>
-      <w:r>
-        <w:t>holmes</w:t>
-      </w:r>
-      <w:proofErr w:type="spellEnd"/>
-      <w:r>
-        <w:t xml:space="preserve">"              A Study in Scarlet (+ </w:t>
-      </w:r>
-      <w:proofErr w:type="gramStart"/>
-      <w:r>
-        <w:t xml:space="preserve">Doyle)   </w:t>
-      </w:r>
-      <w:proofErr w:type="gramEnd"/>
-      <w:r>
-        <w:t>YES     7</w:t>
-      </w:r>
-    </w:p>
-    <w:p>
-      <w:r>
-        <w:t>"</w:t>
-      </w:r>
-      <w:proofErr w:type="spellStart"/>
-      <w:proofErr w:type="gramStart"/>
-      <w:r>
-        <w:t>moby</w:t>
-      </w:r>
-      <w:proofErr w:type="spellEnd"/>
-      <w:proofErr w:type="gramEnd"/>
-      <w:r>
-        <w:t xml:space="preserve"> dick"                    Moby Dick                      YES     1</w:t>
-      </w:r>
-    </w:p>
-    <w:p>
-      <w:proofErr w:type="spellStart"/>
-      <w:r>
-        <w:t>dracul</w:t>
-      </w:r>
-      <w:proofErr w:type="spellEnd"/>
-      <w:r>
-        <w:t>*                        Dracula                        YES     1</w:t>
-      </w:r>
-    </w:p>
-    <w:p>
-      <w:proofErr w:type="spellStart"/>
-      <w:r>
-        <w:t>karamaz</w:t>
-      </w:r>
-      <w:proofErr w:type="spellEnd"/>
-      <w:r>
-        <w:t>*                       The Brothers Karamazov         YES     2</w:t>
-      </w:r>
-    </w:p>
-    <w:p>
-      <w:proofErr w:type="spellStart"/>
-      <w:r>
-        <w:t>zarathustr</w:t>
-      </w:r>
-      <w:proofErr w:type="spellEnd"/>
-      <w:r>
-        <w:t>*                    Thus Spake Zarathustra         YES     4</w:t>
-      </w:r>
-    </w:p>
-    <w:p>
-      <w:proofErr w:type="spellStart"/>
-      <w:r>
-        <w:t>huckleberr</w:t>
-      </w:r>
-      <w:proofErr w:type="spellEnd"/>
-      <w:r>
-        <w:t>*                    Adventures of Huckleberry Finn YES     3</w:t>
-      </w:r>
-    </w:p>
-    <w:p>
-      <w:proofErr w:type="spellStart"/>
-      <w:r>
-        <w:t>raskolnik</w:t>
-      </w:r>
-      <w:proofErr w:type="spellEnd"/>
-      <w:r>
-        <w:t>*                     Crime and Punishment           YES     1</w:t>
-      </w:r>
-    </w:p>
-    <w:p/>
-    <w:p>
-      <w:r>
-        <w:t>Queries correct</w:t>
-      </w:r>
-      <w:proofErr w:type="gramStart"/>
-      <w:r>
-        <w:t>:  20</w:t>
-      </w:r>
-      <w:proofErr w:type="gramEnd"/>
-      <w:r>
-        <w:t xml:space="preserve"> / 20</w:t>
-      </w:r>
-    </w:p>
-    <w:p>
-      <w:r>
         <w:t>MRR:              1.000</w:t>
       </w:r>
     </w:p>
-    <w:p/>
     <w:p/>
     <w:p>
       <w:pPr>
@@ -822,31 +1381,7 @@
     <w:p/>
     <w:p>
       <w:r>
-        <w:t>20 of 20 queries retrieved the correct book. Keyword, phrase,</w:t>
-      </w:r>
-      <w:r>
-        <w:t xml:space="preserve"> </w:t>
-      </w:r>
-      <w:r>
-        <w:t>and wildcard search all</w:t>
-      </w:r>
-      <w:r>
-        <w:t xml:space="preserve"> </w:t>
-      </w:r>
-      <w:r>
-        <w:t>achieved 100% retrieval on the test set.</w:t>
-      </w:r>
-      <w:r>
-        <w:t xml:space="preserve"> </w:t>
-      </w:r>
-      <w:r>
-        <w:t>While no queries failed outright, two qualitative issues were</w:t>
-      </w:r>
-      <w:r>
-        <w:t xml:space="preserve"> </w:t>
-      </w:r>
-      <w:r>
-        <w:t>observed that affect the usefulness of results in practice.</w:t>
+        <w:t>20 of 20 queries retrieved the correct book. Keyword, phrase, and wildcard search all achieved 100% retrieval on the test set. While no queries failed outright, two qualitative issues were observed that affect the usefulness of results in practice.</w:t>
       </w:r>
     </w:p>
     <w:p/>
@@ -863,13 +1398,7 @@
     <w:p/>
     <w:p>
       <w:r>
-        <w:t>Several keyword queries retrieved the correct book but also</w:t>
-      </w:r>
-      <w:r>
-        <w:t xml:space="preserve"> </w:t>
-      </w:r>
-      <w:r>
-        <w:t>returned many unrelated results:</w:t>
+        <w:t>Several keyword queries retrieved the correct book but also returned many unrelated results:</w:t>
       </w:r>
     </w:p>
     <w:p>
@@ -889,15 +1418,7 @@
     </w:p>
     <w:p>
       <w:r>
-        <w:t xml:space="preserve">  - "sherlock </w:t>
-      </w:r>
-      <w:proofErr w:type="spellStart"/>
-      <w:r>
-        <w:t>holmes</w:t>
-      </w:r>
-      <w:proofErr w:type="spellEnd"/>
-      <w:r>
-        <w:t>" (phrase) → 7 results (all Doyle books</w:t>
+        <w:t xml:space="preserve">  - "sherlock holmes" (phrase) → 7 results (all Doyle books</w:t>
       </w:r>
     </w:p>
     <w:p>
@@ -912,134 +1433,29 @@
     </w:p>
     <w:p>
       <w:r>
-        <w:t xml:space="preserve">  - "</w:t>
-      </w:r>
-      <w:proofErr w:type="spellStart"/>
-      <w:r>
-        <w:t>zarathustra</w:t>
-      </w:r>
-      <w:proofErr w:type="spellEnd"/>
-      <w:r>
-        <w:t>" → 4 results</w:t>
-      </w:r>
-    </w:p>
-    <w:p>
-      <w:r>
-        <w:t xml:space="preserve">  - "</w:t>
-      </w:r>
-      <w:proofErr w:type="spellStart"/>
-      <w:r>
-        <w:t>ahab</w:t>
-      </w:r>
-      <w:proofErr w:type="spellEnd"/>
-      <w:r>
-        <w:t>"        → 4 results</w:t>
-      </w:r>
-    </w:p>
-    <w:p>
-      <w:r>
-        <w:t xml:space="preserve">  - "</w:t>
-      </w:r>
-      <w:proofErr w:type="spellStart"/>
-      <w:r>
-        <w:t>odysseus</w:t>
-      </w:r>
-      <w:proofErr w:type="spellEnd"/>
-      <w:r>
-        <w:t>"    → 4 results</w:t>
+        <w:t xml:space="preserve">  - "zarathustra" → 4 results</w:t>
+      </w:r>
+    </w:p>
+    <w:p>
+      <w:r>
+        <w:t xml:space="preserve">  - "ahab"        → 4 results</w:t>
+      </w:r>
+    </w:p>
+    <w:p>
+      <w:r>
+        <w:t xml:space="preserve">  - "odysseus"    → 4 results</w:t>
       </w:r>
     </w:p>
     <w:p/>
     <w:p>
       <w:r>
-        <w:t xml:space="preserve">Because </w:t>
-      </w:r>
-      <w:r>
-        <w:t xml:space="preserve">our project doesn’t have ranking, it’s not always the most relevant query returned first. </w:t>
-      </w:r>
-      <w:r>
-        <w:t>Adding TF-IDF or BM25 scoring</w:t>
-      </w:r>
-      <w:r>
-        <w:t xml:space="preserve"> </w:t>
-      </w:r>
-      <w:r>
-        <w:t>would address this by ranking books where the term is most</w:t>
-      </w:r>
-      <w:r>
-        <w:t xml:space="preserve"> </w:t>
-      </w:r>
-      <w:r>
-        <w:t>concentrated.</w:t>
+        <w:t>Because our project doesn’t have ranking, it’s not always the most relevant query returned first. Adding TF-IDF or BM25 scoring would address this by ranking books where the term is most concentrated.</w:t>
       </w:r>
     </w:p>
     <w:p/>
     <w:p/>
     <w:p/>
     <w:p/>
-    <w:p>
-      <w:pPr>
-        <w:pBdr>
-          <w:bottom w:val="single" w:sz="6" w:space="1" w:color="auto"/>
-        </w:pBdr>
-      </w:pPr>
-      <w:r>
-        <w:t xml:space="preserve">ERROR CLASS 2: Phrase Search — </w:t>
-      </w:r>
-      <w:proofErr w:type="spellStart"/>
-      <w:r>
-        <w:t>Stopword</w:t>
-      </w:r>
-      <w:proofErr w:type="spellEnd"/>
-      <w:r>
-        <w:t xml:space="preserve"> Sensitivity (latent)</w:t>
-      </w:r>
-    </w:p>
-    <w:p/>
-    <w:p>
-      <w:r>
-        <w:t>Phrase search works by checking for tokens at consecutive</w:t>
-      </w:r>
-      <w:r>
-        <w:t xml:space="preserve"> </w:t>
-      </w:r>
-      <w:r>
-        <w:t>positions in the positional index. Positions are assigned</w:t>
-      </w:r>
-      <w:r>
-        <w:t xml:space="preserve"> </w:t>
-      </w:r>
-      <w:r>
-        <w:t xml:space="preserve">based on the original word order including </w:t>
-      </w:r>
-      <w:proofErr w:type="spellStart"/>
-      <w:r>
-        <w:t>stopwords</w:t>
-      </w:r>
-      <w:proofErr w:type="spellEnd"/>
-      <w:r>
-        <w:t>, but</w:t>
-      </w:r>
-      <w:r>
-        <w:t xml:space="preserve"> </w:t>
-      </w:r>
-      <w:proofErr w:type="spellStart"/>
-      <w:r>
-        <w:t>stopwords</w:t>
-      </w:r>
-      <w:proofErr w:type="spellEnd"/>
-      <w:r>
-        <w:t xml:space="preserve"> are not stored in the index.</w:t>
-      </w:r>
-      <w:r>
-        <w:t xml:space="preserve"> This could lead to false negatives with phrase queries that contain stop words. However, this didn’t come up in our </w:t>
-      </w:r>
-      <w:proofErr w:type="gramStart"/>
-      <w:r>
-        <w:t>testing..</w:t>
-      </w:r>
-      <w:proofErr w:type="gramEnd"/>
-    </w:p>
     <w:p/>
     <w:p/>
     <w:sectPr>
@@ -1781,6 +2197,7 @@
   <w:style w:type="paragraph" w:default="1" w:styleId="Normal">
     <w:name w:val="Normal"/>
     <w:qFormat/>
+    <w:rsid w:val="00D631AA"/>
   </w:style>
   <w:style w:type="paragraph" w:styleId="Heading1">
     <w:name w:val="heading 1"/>

</xml_diff>